<commit_message>
Update RELATÓRIO DE ATIVIDADES DESENVOLVIDAS NO TCC.docx
Relatorio de atividades foii concluido
</commit_message>
<xml_diff>
--- a/tcc-documentacao/Planejamento/planilhas/RELATÓRIO DE ATIVIDADES DESENVOLVIDAS NO TCC.docx
+++ b/tcc-documentacao/Planejamento/planilhas/RELATÓRIO DE ATIVIDADES DESENVOLVIDAS NO TCC.docx
@@ -4,6 +4,7 @@
   <w:body>
     <w:p>
       <w:pPr>
+        <w:jc w:val="center"/>
         <w:rPr>
           <w:b/>
           <w:bCs/>
@@ -17,33 +18,44 @@
         <w:t>RELATÓRIO DE ATIVIDADES DESENVOLVIDAS NO TCC</w:t>
       </w:r>
     </w:p>
-    <w:p/>
+    <w:p>
+      <w:pPr>
+        <w:jc w:val="center"/>
+      </w:pPr>
+    </w:p>
     <w:tbl>
       <w:tblPr>
         <w:tblStyle w:val="Tabelacomgrade"/>
-        <w:tblW w:w="0" w:type="auto"/>
+        <w:tblW w:w="10065" w:type="dxa"/>
+        <w:tblInd w:w="-786" w:type="dxa"/>
         <w:tblLook w:val="04A0" w:firstRow="1" w:lastRow="0" w:firstColumn="1" w:lastColumn="0" w:noHBand="0" w:noVBand="1"/>
       </w:tblPr>
       <w:tblGrid>
-        <w:gridCol w:w="1413"/>
-        <w:gridCol w:w="7081"/>
+        <w:gridCol w:w="1985"/>
+        <w:gridCol w:w="8080"/>
       </w:tblGrid>
       <w:tr>
         <w:tc>
           <w:tcPr>
-            <w:tcW w:w="1413" w:type="dxa"/>
-          </w:tcPr>
-          <w:p>
-            <w:r>
-              <w:t xml:space="preserve">Integrantes </w:t>
-            </w:r>
-          </w:p>
-        </w:tc>
-        <w:tc>
-          <w:tcPr>
-            <w:tcW w:w="7081" w:type="dxa"/>
-          </w:tcPr>
-          <w:p>
+            <w:tcW w:w="1985" w:type="dxa"/>
+          </w:tcPr>
+          <w:p>
+            <w:pPr>
+              <w:jc w:val="center"/>
+            </w:pPr>
+            <w:r>
+              <w:t>Integrantes</w:t>
+            </w:r>
+          </w:p>
+        </w:tc>
+        <w:tc>
+          <w:tcPr>
+            <w:tcW w:w="8080" w:type="dxa"/>
+          </w:tcPr>
+          <w:p>
+            <w:pPr>
+              <w:jc w:val="center"/>
+            </w:pPr>
             <w:r>
               <w:t xml:space="preserve">Atividade Desenvolvida </w:t>
             </w:r>
@@ -55,9 +67,6 @@
             </w:r>
             <w:r>
               <w:t>1</w:t>
-            </w:r>
-            <w:r>
-              <w:t xml:space="preserve"> </w:t>
             </w:r>
           </w:p>
         </w:tc>
@@ -68,131 +77,164 @@
         </w:trPr>
         <w:tc>
           <w:tcPr>
-            <w:tcW w:w="1413" w:type="dxa"/>
-          </w:tcPr>
-          <w:p>
-            <w:r>
-              <w:t>Davi</w:t>
-            </w:r>
-          </w:p>
-        </w:tc>
-        <w:tc>
-          <w:tcPr>
-            <w:tcW w:w="7081" w:type="dxa"/>
-          </w:tcPr>
-          <w:p/>
-        </w:tc>
-      </w:tr>
-      <w:tr>
-        <w:tc>
-          <w:tcPr>
-            <w:tcW w:w="1413" w:type="dxa"/>
-          </w:tcPr>
-          <w:p>
-            <w:proofErr w:type="spellStart"/>
-            <w:r>
-              <w:t>Kauan</w:t>
-            </w:r>
-            <w:proofErr w:type="spellEnd"/>
-          </w:p>
-        </w:tc>
-        <w:tc>
-          <w:tcPr>
-            <w:tcW w:w="7081" w:type="dxa"/>
-          </w:tcPr>
-          <w:p/>
-        </w:tc>
-      </w:tr>
-      <w:tr>
-        <w:tc>
-          <w:tcPr>
-            <w:tcW w:w="1413" w:type="dxa"/>
-          </w:tcPr>
-          <w:p>
-            <w:r>
-              <w:t>Enrico</w:t>
-            </w:r>
-          </w:p>
-        </w:tc>
-        <w:tc>
-          <w:tcPr>
-            <w:tcW w:w="7081" w:type="dxa"/>
-          </w:tcPr>
-          <w:p/>
-        </w:tc>
-      </w:tr>
-      <w:tr>
-        <w:tc>
-          <w:tcPr>
-            <w:tcW w:w="1413" w:type="dxa"/>
-          </w:tcPr>
-          <w:p>
-            <w:r>
-              <w:t>Isaac</w:t>
-            </w:r>
-          </w:p>
-        </w:tc>
-        <w:tc>
-          <w:tcPr>
-            <w:tcW w:w="7081" w:type="dxa"/>
-          </w:tcPr>
-          <w:p/>
-        </w:tc>
-      </w:tr>
-      <w:tr>
-        <w:tc>
-          <w:tcPr>
-            <w:tcW w:w="1413" w:type="dxa"/>
-          </w:tcPr>
-          <w:p>
-            <w:r>
-              <w:t>Nicolas</w:t>
-            </w:r>
-          </w:p>
-        </w:tc>
-        <w:tc>
-          <w:tcPr>
-            <w:tcW w:w="7081" w:type="dxa"/>
-          </w:tcPr>
-          <w:p/>
+            <w:tcW w:w="1985" w:type="dxa"/>
+          </w:tcPr>
+          <w:p>
+            <w:pPr>
+              <w:jc w:val="center"/>
+            </w:pPr>
+            <w:r>
+              <w:t>Felipe Rodrigo</w:t>
+            </w:r>
+          </w:p>
+        </w:tc>
+        <w:tc>
+          <w:tcPr>
+            <w:tcW w:w="8080" w:type="dxa"/>
+          </w:tcPr>
+          <w:p>
+            <w:pPr>
+              <w:jc w:val="center"/>
+            </w:pPr>
+          </w:p>
+        </w:tc>
+      </w:tr>
+      <w:tr>
+        <w:tc>
+          <w:tcPr>
+            <w:tcW w:w="1985" w:type="dxa"/>
+          </w:tcPr>
+          <w:p>
+            <w:pPr>
+              <w:jc w:val="center"/>
+            </w:pPr>
+            <w:r>
+              <w:t>Felipe Rodrigues</w:t>
+            </w:r>
+          </w:p>
+        </w:tc>
+        <w:tc>
+          <w:tcPr>
+            <w:tcW w:w="8080" w:type="dxa"/>
+          </w:tcPr>
+          <w:p>
+            <w:pPr>
+              <w:jc w:val="center"/>
+            </w:pPr>
+          </w:p>
+        </w:tc>
+      </w:tr>
+      <w:tr>
+        <w:tc>
+          <w:tcPr>
+            <w:tcW w:w="1985" w:type="dxa"/>
+          </w:tcPr>
+          <w:p>
+            <w:pPr>
+              <w:jc w:val="center"/>
+            </w:pPr>
+            <w:r>
+              <w:t>Lucas Braz</w:t>
+            </w:r>
+          </w:p>
+        </w:tc>
+        <w:tc>
+          <w:tcPr>
+            <w:tcW w:w="8080" w:type="dxa"/>
+          </w:tcPr>
+          <w:p>
+            <w:pPr>
+              <w:jc w:val="center"/>
+            </w:pPr>
+          </w:p>
+        </w:tc>
+      </w:tr>
+      <w:tr>
+        <w:tc>
+          <w:tcPr>
+            <w:tcW w:w="1985" w:type="dxa"/>
+          </w:tcPr>
+          <w:p>
+            <w:pPr>
+              <w:jc w:val="center"/>
+            </w:pPr>
+            <w:r>
+              <w:t>Valter Tertuliano</w:t>
+            </w:r>
+          </w:p>
+        </w:tc>
+        <w:tc>
+          <w:tcPr>
+            <w:tcW w:w="8080" w:type="dxa"/>
+          </w:tcPr>
+          <w:p>
+            <w:pPr>
+              <w:jc w:val="center"/>
+            </w:pPr>
+          </w:p>
+        </w:tc>
+      </w:tr>
+      <w:tr>
+        <w:tc>
+          <w:tcPr>
+            <w:tcW w:w="1985" w:type="dxa"/>
+          </w:tcPr>
+          <w:p>
+            <w:pPr>
+              <w:jc w:val="center"/>
+            </w:pPr>
+            <w:r>
+              <w:t>Joshua</w:t>
+            </w:r>
+          </w:p>
+        </w:tc>
+        <w:tc>
+          <w:tcPr>
+            <w:tcW w:w="8080" w:type="dxa"/>
+          </w:tcPr>
+          <w:p>
+            <w:pPr>
+              <w:jc w:val="center"/>
+            </w:pPr>
+          </w:p>
         </w:tc>
       </w:tr>
     </w:tbl>
-    <w:p/>
     <w:tbl>
       <w:tblPr>
         <w:tblStyle w:val="Tabelacomgrade"/>
-        <w:tblW w:w="0" w:type="auto"/>
+        <w:tblpPr w:leftFromText="141" w:rightFromText="141" w:vertAnchor="text" w:horzAnchor="margin" w:tblpXSpec="center" w:tblpY="309"/>
+        <w:tblW w:w="10065" w:type="dxa"/>
         <w:tblLook w:val="04A0" w:firstRow="1" w:lastRow="0" w:firstColumn="1" w:lastColumn="0" w:noHBand="0" w:noVBand="1"/>
       </w:tblPr>
       <w:tblGrid>
-        <w:gridCol w:w="1413"/>
-        <w:gridCol w:w="7081"/>
+        <w:gridCol w:w="1985"/>
+        <w:gridCol w:w="8080"/>
       </w:tblGrid>
       <w:tr>
         <w:tc>
           <w:tcPr>
-            <w:tcW w:w="1413" w:type="dxa"/>
-          </w:tcPr>
-          <w:p>
-            <w:r>
-              <w:t xml:space="preserve">Integrantes </w:t>
-            </w:r>
-          </w:p>
-        </w:tc>
-        <w:tc>
-          <w:tcPr>
-            <w:tcW w:w="7081" w:type="dxa"/>
-          </w:tcPr>
-          <w:p>
-            <w:r>
-              <w:t>Atividade Desenvolvida - Agosto - Semana 0</w:t>
-            </w:r>
-            <w:r>
-              <w:t>2</w:t>
-            </w:r>
-            <w:r>
-              <w:t xml:space="preserve"> </w:t>
+            <w:tcW w:w="1985" w:type="dxa"/>
+          </w:tcPr>
+          <w:p>
+            <w:pPr>
+              <w:jc w:val="center"/>
+            </w:pPr>
+            <w:r>
+              <w:t>Integrantes</w:t>
+            </w:r>
+          </w:p>
+        </w:tc>
+        <w:tc>
+          <w:tcPr>
+            <w:tcW w:w="8080" w:type="dxa"/>
+          </w:tcPr>
+          <w:p>
+            <w:pPr>
+              <w:jc w:val="center"/>
+            </w:pPr>
+            <w:r>
+              <w:t>Atividade Desenvolvida - Agosto - Semana 02</w:t>
             </w:r>
           </w:p>
         </w:tc>
@@ -203,131 +245,174 @@
         </w:trPr>
         <w:tc>
           <w:tcPr>
-            <w:tcW w:w="1413" w:type="dxa"/>
-          </w:tcPr>
-          <w:p>
-            <w:r>
-              <w:t>Davi</w:t>
-            </w:r>
-          </w:p>
-        </w:tc>
-        <w:tc>
-          <w:tcPr>
-            <w:tcW w:w="7081" w:type="dxa"/>
-          </w:tcPr>
-          <w:p/>
-        </w:tc>
-      </w:tr>
-      <w:tr>
-        <w:tc>
-          <w:tcPr>
-            <w:tcW w:w="1413" w:type="dxa"/>
-          </w:tcPr>
-          <w:p>
-            <w:proofErr w:type="spellStart"/>
-            <w:r>
-              <w:t>Kauan</w:t>
-            </w:r>
-            <w:proofErr w:type="spellEnd"/>
-          </w:p>
-        </w:tc>
-        <w:tc>
-          <w:tcPr>
-            <w:tcW w:w="7081" w:type="dxa"/>
-          </w:tcPr>
-          <w:p/>
-        </w:tc>
-      </w:tr>
-      <w:tr>
-        <w:tc>
-          <w:tcPr>
-            <w:tcW w:w="1413" w:type="dxa"/>
-          </w:tcPr>
-          <w:p>
-            <w:r>
-              <w:t>Enrico</w:t>
-            </w:r>
-          </w:p>
-        </w:tc>
-        <w:tc>
-          <w:tcPr>
-            <w:tcW w:w="7081" w:type="dxa"/>
-          </w:tcPr>
-          <w:p/>
-        </w:tc>
-      </w:tr>
-      <w:tr>
-        <w:tc>
-          <w:tcPr>
-            <w:tcW w:w="1413" w:type="dxa"/>
-          </w:tcPr>
-          <w:p>
-            <w:r>
-              <w:t>Isaac</w:t>
-            </w:r>
-          </w:p>
-        </w:tc>
-        <w:tc>
-          <w:tcPr>
-            <w:tcW w:w="7081" w:type="dxa"/>
-          </w:tcPr>
-          <w:p/>
-        </w:tc>
-      </w:tr>
-      <w:tr>
-        <w:tc>
-          <w:tcPr>
-            <w:tcW w:w="1413" w:type="dxa"/>
-          </w:tcPr>
-          <w:p>
-            <w:r>
-              <w:t>Nicolas</w:t>
-            </w:r>
-          </w:p>
-        </w:tc>
-        <w:tc>
-          <w:tcPr>
-            <w:tcW w:w="7081" w:type="dxa"/>
-          </w:tcPr>
-          <w:p/>
+            <w:tcW w:w="1985" w:type="dxa"/>
+          </w:tcPr>
+          <w:p>
+            <w:pPr>
+              <w:jc w:val="center"/>
+            </w:pPr>
+            <w:r>
+              <w:t>Felipe Rodrigo</w:t>
+            </w:r>
+          </w:p>
+        </w:tc>
+        <w:tc>
+          <w:tcPr>
+            <w:tcW w:w="8080" w:type="dxa"/>
+          </w:tcPr>
+          <w:p>
+            <w:pPr>
+              <w:jc w:val="center"/>
+            </w:pPr>
+          </w:p>
+        </w:tc>
+      </w:tr>
+      <w:tr>
+        <w:tc>
+          <w:tcPr>
+            <w:tcW w:w="1985" w:type="dxa"/>
+          </w:tcPr>
+          <w:p>
+            <w:pPr>
+              <w:jc w:val="center"/>
+            </w:pPr>
+            <w:r>
+              <w:t>Felipe Rodrigues</w:t>
+            </w:r>
+          </w:p>
+        </w:tc>
+        <w:tc>
+          <w:tcPr>
+            <w:tcW w:w="8080" w:type="dxa"/>
+          </w:tcPr>
+          <w:p>
+            <w:pPr>
+              <w:jc w:val="center"/>
+            </w:pPr>
+          </w:p>
+        </w:tc>
+      </w:tr>
+      <w:tr>
+        <w:tc>
+          <w:tcPr>
+            <w:tcW w:w="1985" w:type="dxa"/>
+          </w:tcPr>
+          <w:p>
+            <w:pPr>
+              <w:jc w:val="center"/>
+            </w:pPr>
+            <w:r>
+              <w:t>Lucas Braz</w:t>
+            </w:r>
+          </w:p>
+        </w:tc>
+        <w:tc>
+          <w:tcPr>
+            <w:tcW w:w="8080" w:type="dxa"/>
+          </w:tcPr>
+          <w:p>
+            <w:pPr>
+              <w:jc w:val="center"/>
+            </w:pPr>
+          </w:p>
+        </w:tc>
+      </w:tr>
+      <w:tr>
+        <w:tc>
+          <w:tcPr>
+            <w:tcW w:w="1985" w:type="dxa"/>
+          </w:tcPr>
+          <w:p>
+            <w:pPr>
+              <w:jc w:val="center"/>
+            </w:pPr>
+            <w:r>
+              <w:t>Valter Tertuliano</w:t>
+            </w:r>
+          </w:p>
+        </w:tc>
+        <w:tc>
+          <w:tcPr>
+            <w:tcW w:w="8080" w:type="dxa"/>
+          </w:tcPr>
+          <w:p>
+            <w:pPr>
+              <w:jc w:val="center"/>
+            </w:pPr>
+          </w:p>
+        </w:tc>
+      </w:tr>
+      <w:tr>
+        <w:tc>
+          <w:tcPr>
+            <w:tcW w:w="1985" w:type="dxa"/>
+          </w:tcPr>
+          <w:p>
+            <w:pPr>
+              <w:jc w:val="center"/>
+            </w:pPr>
+            <w:r>
+              <w:t>Joshua</w:t>
+            </w:r>
+          </w:p>
+        </w:tc>
+        <w:tc>
+          <w:tcPr>
+            <w:tcW w:w="8080" w:type="dxa"/>
+          </w:tcPr>
+          <w:p>
+            <w:pPr>
+              <w:jc w:val="center"/>
+            </w:pPr>
+          </w:p>
         </w:tc>
       </w:tr>
     </w:tbl>
-    <w:p/>
+    <w:p>
+      <w:pPr>
+        <w:jc w:val="center"/>
+      </w:pPr>
+    </w:p>
+    <w:p>
+      <w:pPr>
+        <w:jc w:val="center"/>
+      </w:pPr>
+    </w:p>
     <w:tbl>
       <w:tblPr>
         <w:tblStyle w:val="Tabelacomgrade"/>
-        <w:tblW w:w="0" w:type="auto"/>
+        <w:tblpPr w:leftFromText="141" w:rightFromText="141" w:vertAnchor="text" w:horzAnchor="margin" w:tblpXSpec="center" w:tblpY="-61"/>
+        <w:tblW w:w="10065" w:type="dxa"/>
         <w:tblLook w:val="04A0" w:firstRow="1" w:lastRow="0" w:firstColumn="1" w:lastColumn="0" w:noHBand="0" w:noVBand="1"/>
       </w:tblPr>
       <w:tblGrid>
-        <w:gridCol w:w="1413"/>
-        <w:gridCol w:w="7081"/>
+        <w:gridCol w:w="1985"/>
+        <w:gridCol w:w="8080"/>
       </w:tblGrid>
       <w:tr>
         <w:tc>
           <w:tcPr>
-            <w:tcW w:w="1413" w:type="dxa"/>
-          </w:tcPr>
-          <w:p>
-            <w:r>
-              <w:t xml:space="preserve">Integrantes </w:t>
-            </w:r>
-          </w:p>
-        </w:tc>
-        <w:tc>
-          <w:tcPr>
-            <w:tcW w:w="7081" w:type="dxa"/>
-          </w:tcPr>
-          <w:p>
-            <w:r>
-              <w:t>Atividade Desenvolvida - Agosto - Semana 0</w:t>
-            </w:r>
-            <w:r>
-              <w:t>3</w:t>
-            </w:r>
-            <w:r>
-              <w:t xml:space="preserve"> </w:t>
+            <w:tcW w:w="1985" w:type="dxa"/>
+          </w:tcPr>
+          <w:p>
+            <w:pPr>
+              <w:jc w:val="center"/>
+            </w:pPr>
+            <w:r>
+              <w:t>Integrantes</w:t>
+            </w:r>
+          </w:p>
+        </w:tc>
+        <w:tc>
+          <w:tcPr>
+            <w:tcW w:w="8080" w:type="dxa"/>
+          </w:tcPr>
+          <w:p>
+            <w:pPr>
+              <w:jc w:val="center"/>
+            </w:pPr>
+            <w:r>
+              <w:t>Atividade Desenvolvida - Agosto - Semana 03</w:t>
             </w:r>
           </w:p>
         </w:tc>
@@ -338,131 +423,169 @@
         </w:trPr>
         <w:tc>
           <w:tcPr>
-            <w:tcW w:w="1413" w:type="dxa"/>
-          </w:tcPr>
-          <w:p>
-            <w:r>
-              <w:t>Davi</w:t>
-            </w:r>
-          </w:p>
-        </w:tc>
-        <w:tc>
-          <w:tcPr>
-            <w:tcW w:w="7081" w:type="dxa"/>
-          </w:tcPr>
-          <w:p/>
-        </w:tc>
-      </w:tr>
-      <w:tr>
-        <w:tc>
-          <w:tcPr>
-            <w:tcW w:w="1413" w:type="dxa"/>
-          </w:tcPr>
-          <w:p>
-            <w:proofErr w:type="spellStart"/>
-            <w:r>
-              <w:t>Kauan</w:t>
-            </w:r>
-            <w:proofErr w:type="spellEnd"/>
-          </w:p>
-        </w:tc>
-        <w:tc>
-          <w:tcPr>
-            <w:tcW w:w="7081" w:type="dxa"/>
-          </w:tcPr>
-          <w:p/>
-        </w:tc>
-      </w:tr>
-      <w:tr>
-        <w:tc>
-          <w:tcPr>
-            <w:tcW w:w="1413" w:type="dxa"/>
-          </w:tcPr>
-          <w:p>
-            <w:r>
-              <w:t>Enrico</w:t>
-            </w:r>
-          </w:p>
-        </w:tc>
-        <w:tc>
-          <w:tcPr>
-            <w:tcW w:w="7081" w:type="dxa"/>
-          </w:tcPr>
-          <w:p/>
-        </w:tc>
-      </w:tr>
-      <w:tr>
-        <w:tc>
-          <w:tcPr>
-            <w:tcW w:w="1413" w:type="dxa"/>
-          </w:tcPr>
-          <w:p>
-            <w:r>
-              <w:t>Isaac</w:t>
-            </w:r>
-          </w:p>
-        </w:tc>
-        <w:tc>
-          <w:tcPr>
-            <w:tcW w:w="7081" w:type="dxa"/>
-          </w:tcPr>
-          <w:p/>
-        </w:tc>
-      </w:tr>
-      <w:tr>
-        <w:tc>
-          <w:tcPr>
-            <w:tcW w:w="1413" w:type="dxa"/>
-          </w:tcPr>
-          <w:p>
-            <w:r>
-              <w:t>Nicolas</w:t>
-            </w:r>
-          </w:p>
-        </w:tc>
-        <w:tc>
-          <w:tcPr>
-            <w:tcW w:w="7081" w:type="dxa"/>
-          </w:tcPr>
-          <w:p/>
+            <w:tcW w:w="1985" w:type="dxa"/>
+          </w:tcPr>
+          <w:p>
+            <w:pPr>
+              <w:jc w:val="center"/>
+            </w:pPr>
+            <w:r>
+              <w:t>Felipe Rodrigo</w:t>
+            </w:r>
+          </w:p>
+        </w:tc>
+        <w:tc>
+          <w:tcPr>
+            <w:tcW w:w="8080" w:type="dxa"/>
+          </w:tcPr>
+          <w:p>
+            <w:pPr>
+              <w:jc w:val="center"/>
+            </w:pPr>
+          </w:p>
+        </w:tc>
+      </w:tr>
+      <w:tr>
+        <w:tc>
+          <w:tcPr>
+            <w:tcW w:w="1985" w:type="dxa"/>
+          </w:tcPr>
+          <w:p>
+            <w:pPr>
+              <w:jc w:val="center"/>
+            </w:pPr>
+            <w:r>
+              <w:t>Felipe Rodrigues</w:t>
+            </w:r>
+          </w:p>
+        </w:tc>
+        <w:tc>
+          <w:tcPr>
+            <w:tcW w:w="8080" w:type="dxa"/>
+          </w:tcPr>
+          <w:p>
+            <w:pPr>
+              <w:jc w:val="center"/>
+            </w:pPr>
+          </w:p>
+        </w:tc>
+      </w:tr>
+      <w:tr>
+        <w:tc>
+          <w:tcPr>
+            <w:tcW w:w="1985" w:type="dxa"/>
+          </w:tcPr>
+          <w:p>
+            <w:pPr>
+              <w:jc w:val="center"/>
+            </w:pPr>
+            <w:r>
+              <w:t>Lucas Braz</w:t>
+            </w:r>
+          </w:p>
+        </w:tc>
+        <w:tc>
+          <w:tcPr>
+            <w:tcW w:w="8080" w:type="dxa"/>
+          </w:tcPr>
+          <w:p>
+            <w:pPr>
+              <w:jc w:val="center"/>
+            </w:pPr>
+          </w:p>
+        </w:tc>
+      </w:tr>
+      <w:tr>
+        <w:tc>
+          <w:tcPr>
+            <w:tcW w:w="1985" w:type="dxa"/>
+          </w:tcPr>
+          <w:p>
+            <w:pPr>
+              <w:jc w:val="center"/>
+            </w:pPr>
+            <w:r>
+              <w:t>Valter Tertuliano</w:t>
+            </w:r>
+          </w:p>
+        </w:tc>
+        <w:tc>
+          <w:tcPr>
+            <w:tcW w:w="8080" w:type="dxa"/>
+          </w:tcPr>
+          <w:p>
+            <w:pPr>
+              <w:jc w:val="center"/>
+            </w:pPr>
+          </w:p>
+        </w:tc>
+      </w:tr>
+      <w:tr>
+        <w:tc>
+          <w:tcPr>
+            <w:tcW w:w="1985" w:type="dxa"/>
+          </w:tcPr>
+          <w:p>
+            <w:pPr>
+              <w:jc w:val="center"/>
+            </w:pPr>
+            <w:r>
+              <w:t>Joshua</w:t>
+            </w:r>
+          </w:p>
+        </w:tc>
+        <w:tc>
+          <w:tcPr>
+            <w:tcW w:w="8080" w:type="dxa"/>
+          </w:tcPr>
+          <w:p>
+            <w:pPr>
+              <w:jc w:val="center"/>
+            </w:pPr>
+          </w:p>
         </w:tc>
       </w:tr>
     </w:tbl>
-    <w:p/>
+    <w:p>
+      <w:pPr>
+        <w:jc w:val="center"/>
+      </w:pPr>
+    </w:p>
     <w:tbl>
       <w:tblPr>
         <w:tblStyle w:val="Tabelacomgrade"/>
-        <w:tblW w:w="0" w:type="auto"/>
+        <w:tblpPr w:leftFromText="141" w:rightFromText="141" w:vertAnchor="text" w:horzAnchor="margin" w:tblpXSpec="center" w:tblpY="-31"/>
+        <w:tblW w:w="10065" w:type="dxa"/>
         <w:tblLook w:val="04A0" w:firstRow="1" w:lastRow="0" w:firstColumn="1" w:lastColumn="0" w:noHBand="0" w:noVBand="1"/>
       </w:tblPr>
       <w:tblGrid>
-        <w:gridCol w:w="1413"/>
-        <w:gridCol w:w="7081"/>
+        <w:gridCol w:w="1985"/>
+        <w:gridCol w:w="8080"/>
       </w:tblGrid>
       <w:tr>
         <w:tc>
           <w:tcPr>
-            <w:tcW w:w="1413" w:type="dxa"/>
-          </w:tcPr>
-          <w:p>
-            <w:r>
-              <w:t xml:space="preserve">Integrantes </w:t>
-            </w:r>
-          </w:p>
-        </w:tc>
-        <w:tc>
-          <w:tcPr>
-            <w:tcW w:w="7081" w:type="dxa"/>
-          </w:tcPr>
-          <w:p>
-            <w:r>
-              <w:t>Atividade Desenvolvida - Agosto - Semana 0</w:t>
-            </w:r>
-            <w:r>
-              <w:t>4</w:t>
-            </w:r>
-            <w:r>
-              <w:t xml:space="preserve"> </w:t>
+            <w:tcW w:w="1985" w:type="dxa"/>
+          </w:tcPr>
+          <w:p>
+            <w:pPr>
+              <w:jc w:val="center"/>
+            </w:pPr>
+            <w:r>
+              <w:t>Integrantes</w:t>
+            </w:r>
+          </w:p>
+        </w:tc>
+        <w:tc>
+          <w:tcPr>
+            <w:tcW w:w="8080" w:type="dxa"/>
+          </w:tcPr>
+          <w:p>
+            <w:pPr>
+              <w:jc w:val="center"/>
+            </w:pPr>
+            <w:r>
+              <w:t>Atividade Desenvolvida - Agosto - Semana 04</w:t>
             </w:r>
           </w:p>
         </w:tc>
@@ -473,147 +596,169 @@
         </w:trPr>
         <w:tc>
           <w:tcPr>
-            <w:tcW w:w="1413" w:type="dxa"/>
-          </w:tcPr>
-          <w:p>
-            <w:r>
-              <w:t>Davi</w:t>
-            </w:r>
-          </w:p>
-        </w:tc>
-        <w:tc>
-          <w:tcPr>
-            <w:tcW w:w="7081" w:type="dxa"/>
-          </w:tcPr>
-          <w:p/>
-        </w:tc>
-      </w:tr>
-      <w:tr>
-        <w:tc>
-          <w:tcPr>
-            <w:tcW w:w="1413" w:type="dxa"/>
-          </w:tcPr>
-          <w:p>
-            <w:proofErr w:type="spellStart"/>
-            <w:r>
-              <w:t>Kauan</w:t>
-            </w:r>
-            <w:proofErr w:type="spellEnd"/>
-          </w:p>
-        </w:tc>
-        <w:tc>
-          <w:tcPr>
-            <w:tcW w:w="7081" w:type="dxa"/>
-          </w:tcPr>
-          <w:p/>
-        </w:tc>
-      </w:tr>
-      <w:tr>
-        <w:tc>
-          <w:tcPr>
-            <w:tcW w:w="1413" w:type="dxa"/>
-          </w:tcPr>
-          <w:p>
-            <w:r>
-              <w:t>Enrico</w:t>
-            </w:r>
-          </w:p>
-        </w:tc>
-        <w:tc>
-          <w:tcPr>
-            <w:tcW w:w="7081" w:type="dxa"/>
-          </w:tcPr>
-          <w:p/>
-        </w:tc>
-      </w:tr>
-      <w:tr>
-        <w:tc>
-          <w:tcPr>
-            <w:tcW w:w="1413" w:type="dxa"/>
-          </w:tcPr>
-          <w:p>
-            <w:r>
-              <w:t>Isaac</w:t>
-            </w:r>
-          </w:p>
-        </w:tc>
-        <w:tc>
-          <w:tcPr>
-            <w:tcW w:w="7081" w:type="dxa"/>
-          </w:tcPr>
-          <w:p/>
-        </w:tc>
-      </w:tr>
-      <w:tr>
-        <w:tc>
-          <w:tcPr>
-            <w:tcW w:w="1413" w:type="dxa"/>
-          </w:tcPr>
-          <w:p>
-            <w:r>
-              <w:t>Nicolas</w:t>
-            </w:r>
-          </w:p>
-        </w:tc>
-        <w:tc>
-          <w:tcPr>
-            <w:tcW w:w="7081" w:type="dxa"/>
-          </w:tcPr>
-          <w:p/>
-        </w:tc>
-      </w:tr>
-      <w:tr>
-        <w:tc>
-          <w:tcPr>
-            <w:tcW w:w="1413" w:type="dxa"/>
-          </w:tcPr>
-          <w:p/>
-        </w:tc>
-        <w:tc>
-          <w:tcPr>
-            <w:tcW w:w="7081" w:type="dxa"/>
-          </w:tcPr>
-          <w:p/>
+            <w:tcW w:w="1985" w:type="dxa"/>
+          </w:tcPr>
+          <w:p>
+            <w:pPr>
+              <w:jc w:val="center"/>
+            </w:pPr>
+            <w:r>
+              <w:t>Felipe Rodrigo</w:t>
+            </w:r>
+          </w:p>
+        </w:tc>
+        <w:tc>
+          <w:tcPr>
+            <w:tcW w:w="8080" w:type="dxa"/>
+          </w:tcPr>
+          <w:p>
+            <w:pPr>
+              <w:jc w:val="center"/>
+            </w:pPr>
+          </w:p>
+        </w:tc>
+      </w:tr>
+      <w:tr>
+        <w:tc>
+          <w:tcPr>
+            <w:tcW w:w="1985" w:type="dxa"/>
+          </w:tcPr>
+          <w:p>
+            <w:pPr>
+              <w:jc w:val="center"/>
+            </w:pPr>
+            <w:r>
+              <w:t>Felipe Rodrigues</w:t>
+            </w:r>
+          </w:p>
+        </w:tc>
+        <w:tc>
+          <w:tcPr>
+            <w:tcW w:w="8080" w:type="dxa"/>
+          </w:tcPr>
+          <w:p>
+            <w:pPr>
+              <w:jc w:val="center"/>
+            </w:pPr>
+          </w:p>
+        </w:tc>
+      </w:tr>
+      <w:tr>
+        <w:tc>
+          <w:tcPr>
+            <w:tcW w:w="1985" w:type="dxa"/>
+          </w:tcPr>
+          <w:p>
+            <w:pPr>
+              <w:jc w:val="center"/>
+            </w:pPr>
+            <w:r>
+              <w:t>Lucas Braz</w:t>
+            </w:r>
+          </w:p>
+        </w:tc>
+        <w:tc>
+          <w:tcPr>
+            <w:tcW w:w="8080" w:type="dxa"/>
+          </w:tcPr>
+          <w:p>
+            <w:pPr>
+              <w:jc w:val="center"/>
+            </w:pPr>
+          </w:p>
+        </w:tc>
+      </w:tr>
+      <w:tr>
+        <w:tc>
+          <w:tcPr>
+            <w:tcW w:w="1985" w:type="dxa"/>
+          </w:tcPr>
+          <w:p>
+            <w:pPr>
+              <w:jc w:val="center"/>
+            </w:pPr>
+            <w:r>
+              <w:t>Valter Tertuliano</w:t>
+            </w:r>
+          </w:p>
+        </w:tc>
+        <w:tc>
+          <w:tcPr>
+            <w:tcW w:w="8080" w:type="dxa"/>
+          </w:tcPr>
+          <w:p>
+            <w:pPr>
+              <w:jc w:val="center"/>
+            </w:pPr>
+          </w:p>
+        </w:tc>
+      </w:tr>
+      <w:tr>
+        <w:tc>
+          <w:tcPr>
+            <w:tcW w:w="1985" w:type="dxa"/>
+          </w:tcPr>
+          <w:p>
+            <w:pPr>
+              <w:jc w:val="center"/>
+            </w:pPr>
+            <w:r>
+              <w:t>Joshua</w:t>
+            </w:r>
+          </w:p>
+        </w:tc>
+        <w:tc>
+          <w:tcPr>
+            <w:tcW w:w="8080" w:type="dxa"/>
+          </w:tcPr>
+          <w:p>
+            <w:pPr>
+              <w:jc w:val="center"/>
+            </w:pPr>
+          </w:p>
         </w:tc>
       </w:tr>
     </w:tbl>
-    <w:p/>
+    <w:p>
+      <w:pPr>
+        <w:jc w:val="center"/>
+      </w:pPr>
+    </w:p>
     <w:tbl>
       <w:tblPr>
         <w:tblStyle w:val="Tabelacomgrade"/>
-        <w:tblW w:w="0" w:type="auto"/>
+        <w:tblpPr w:leftFromText="141" w:rightFromText="141" w:vertAnchor="text" w:horzAnchor="margin" w:tblpXSpec="center" w:tblpY="73"/>
+        <w:tblW w:w="10065" w:type="dxa"/>
         <w:tblLook w:val="04A0" w:firstRow="1" w:lastRow="0" w:firstColumn="1" w:lastColumn="0" w:noHBand="0" w:noVBand="1"/>
       </w:tblPr>
       <w:tblGrid>
-        <w:gridCol w:w="1413"/>
-        <w:gridCol w:w="7081"/>
+        <w:gridCol w:w="1985"/>
+        <w:gridCol w:w="8080"/>
       </w:tblGrid>
       <w:tr>
         <w:tc>
           <w:tcPr>
-            <w:tcW w:w="1413" w:type="dxa"/>
-          </w:tcPr>
-          <w:p>
-            <w:r>
-              <w:t xml:space="preserve">Integrantes </w:t>
-            </w:r>
-          </w:p>
-        </w:tc>
-        <w:tc>
-          <w:tcPr>
-            <w:tcW w:w="7081" w:type="dxa"/>
-          </w:tcPr>
-          <w:p>
-            <w:r>
-              <w:t xml:space="preserve">Atividade Desenvolvida - </w:t>
-            </w:r>
-            <w:r>
-              <w:t>Setembro</w:t>
-            </w:r>
-            <w:bookmarkStart w:id="0" w:name="_GoBack"/>
-            <w:bookmarkEnd w:id="0"/>
-            <w:r>
-              <w:t xml:space="preserve"> - Semana 01 </w:t>
+            <w:tcW w:w="1985" w:type="dxa"/>
+          </w:tcPr>
+          <w:p>
+            <w:pPr>
+              <w:jc w:val="center"/>
+            </w:pPr>
+            <w:r>
+              <w:t>Integrantes</w:t>
+            </w:r>
+          </w:p>
+        </w:tc>
+        <w:tc>
+          <w:tcPr>
+            <w:tcW w:w="8080" w:type="dxa"/>
+          </w:tcPr>
+          <w:p>
+            <w:pPr>
+              <w:jc w:val="center"/>
+            </w:pPr>
+            <w:r>
+              <w:t>Atividade Desenvolvida - Setembro - Semana 01</w:t>
             </w:r>
           </w:p>
         </w:tc>
@@ -624,97 +769,167 @@
         </w:trPr>
         <w:tc>
           <w:tcPr>
-            <w:tcW w:w="1413" w:type="dxa"/>
-          </w:tcPr>
-          <w:p>
-            <w:r>
-              <w:t>Davi</w:t>
-            </w:r>
-          </w:p>
-        </w:tc>
-        <w:tc>
-          <w:tcPr>
-            <w:tcW w:w="7081" w:type="dxa"/>
-          </w:tcPr>
-          <w:p/>
-        </w:tc>
-      </w:tr>
-      <w:tr>
-        <w:tc>
-          <w:tcPr>
-            <w:tcW w:w="1413" w:type="dxa"/>
-          </w:tcPr>
-          <w:p>
-            <w:proofErr w:type="spellStart"/>
-            <w:r>
-              <w:t>Kauan</w:t>
-            </w:r>
-            <w:proofErr w:type="spellEnd"/>
-          </w:p>
-        </w:tc>
-        <w:tc>
-          <w:tcPr>
-            <w:tcW w:w="7081" w:type="dxa"/>
-          </w:tcPr>
-          <w:p/>
-        </w:tc>
-      </w:tr>
-      <w:tr>
-        <w:tc>
-          <w:tcPr>
-            <w:tcW w:w="1413" w:type="dxa"/>
-          </w:tcPr>
-          <w:p>
-            <w:r>
-              <w:t>Enrico</w:t>
-            </w:r>
-          </w:p>
-        </w:tc>
-        <w:tc>
-          <w:tcPr>
-            <w:tcW w:w="7081" w:type="dxa"/>
-          </w:tcPr>
-          <w:p/>
-        </w:tc>
-      </w:tr>
-      <w:tr>
-        <w:tc>
-          <w:tcPr>
-            <w:tcW w:w="1413" w:type="dxa"/>
-          </w:tcPr>
-          <w:p>
-            <w:r>
-              <w:t>Isaac</w:t>
-            </w:r>
-          </w:p>
-        </w:tc>
-        <w:tc>
-          <w:tcPr>
-            <w:tcW w:w="7081" w:type="dxa"/>
-          </w:tcPr>
-          <w:p/>
-        </w:tc>
-      </w:tr>
-      <w:tr>
-        <w:tc>
-          <w:tcPr>
-            <w:tcW w:w="1413" w:type="dxa"/>
-          </w:tcPr>
-          <w:p>
-            <w:r>
-              <w:t>Nicolas</w:t>
-            </w:r>
-          </w:p>
-        </w:tc>
-        <w:tc>
-          <w:tcPr>
-            <w:tcW w:w="7081" w:type="dxa"/>
-          </w:tcPr>
-          <w:p/>
+            <w:tcW w:w="1985" w:type="dxa"/>
+          </w:tcPr>
+          <w:p>
+            <w:pPr>
+              <w:jc w:val="center"/>
+            </w:pPr>
+            <w:r>
+              <w:t>Felipe Rodrigo</w:t>
+            </w:r>
+          </w:p>
+        </w:tc>
+        <w:tc>
+          <w:tcPr>
+            <w:tcW w:w="8080" w:type="dxa"/>
+          </w:tcPr>
+          <w:p>
+            <w:pPr>
+              <w:jc w:val="center"/>
+            </w:pPr>
+          </w:p>
+        </w:tc>
+      </w:tr>
+      <w:tr>
+        <w:tc>
+          <w:tcPr>
+            <w:tcW w:w="1985" w:type="dxa"/>
+          </w:tcPr>
+          <w:p>
+            <w:pPr>
+              <w:jc w:val="center"/>
+            </w:pPr>
+            <w:r>
+              <w:t>Felipe Rodrigues</w:t>
+            </w:r>
+          </w:p>
+        </w:tc>
+        <w:tc>
+          <w:tcPr>
+            <w:tcW w:w="8080" w:type="dxa"/>
+          </w:tcPr>
+          <w:p>
+            <w:pPr>
+              <w:jc w:val="center"/>
+            </w:pPr>
+          </w:p>
+        </w:tc>
+      </w:tr>
+      <w:tr>
+        <w:tc>
+          <w:tcPr>
+            <w:tcW w:w="1985" w:type="dxa"/>
+          </w:tcPr>
+          <w:p>
+            <w:pPr>
+              <w:jc w:val="center"/>
+            </w:pPr>
+            <w:r>
+              <w:t>Lucas Braz</w:t>
+            </w:r>
+          </w:p>
+        </w:tc>
+        <w:tc>
+          <w:tcPr>
+            <w:tcW w:w="8080" w:type="dxa"/>
+          </w:tcPr>
+          <w:p>
+            <w:pPr>
+              <w:jc w:val="center"/>
+            </w:pPr>
+          </w:p>
+        </w:tc>
+      </w:tr>
+      <w:tr>
+        <w:tc>
+          <w:tcPr>
+            <w:tcW w:w="1985" w:type="dxa"/>
+          </w:tcPr>
+          <w:p>
+            <w:pPr>
+              <w:jc w:val="center"/>
+            </w:pPr>
+            <w:r>
+              <w:t>Valter Tertuliano</w:t>
+            </w:r>
+          </w:p>
+        </w:tc>
+        <w:tc>
+          <w:tcPr>
+            <w:tcW w:w="8080" w:type="dxa"/>
+          </w:tcPr>
+          <w:p>
+            <w:pPr>
+              <w:jc w:val="center"/>
+            </w:pPr>
+          </w:p>
+        </w:tc>
+      </w:tr>
+      <w:tr>
+        <w:tc>
+          <w:tcPr>
+            <w:tcW w:w="1985" w:type="dxa"/>
+          </w:tcPr>
+          <w:p>
+            <w:pPr>
+              <w:jc w:val="center"/>
+            </w:pPr>
+            <w:r>
+              <w:t>Joshua</w:t>
+            </w:r>
+          </w:p>
+        </w:tc>
+        <w:tc>
+          <w:tcPr>
+            <w:tcW w:w="8080" w:type="dxa"/>
+          </w:tcPr>
+          <w:p>
+            <w:pPr>
+              <w:jc w:val="center"/>
+            </w:pPr>
+          </w:p>
         </w:tc>
       </w:tr>
     </w:tbl>
-    <w:p/>
+    <w:p>
+      <w:pPr>
+        <w:tabs>
+          <w:tab w:val="left" w:pos="180"/>
+        </w:tabs>
+        <w:jc w:val="center"/>
+      </w:pPr>
+    </w:p>
+    <w:p>
+      <w:pPr>
+        <w:tabs>
+          <w:tab w:val="left" w:pos="180"/>
+        </w:tabs>
+      </w:pPr>
+    </w:p>
+    <w:p>
+      <w:pPr>
+        <w:jc w:val="center"/>
+      </w:pPr>
+    </w:p>
+    <w:p>
+      <w:pPr>
+        <w:tabs>
+          <w:tab w:val="left" w:pos="1650"/>
+        </w:tabs>
+        <w:jc w:val="center"/>
+      </w:pPr>
+    </w:p>
+    <w:p>
+      <w:pPr>
+        <w:tabs>
+          <w:tab w:val="left" w:pos="1650"/>
+        </w:tabs>
+        <w:jc w:val="center"/>
+      </w:pPr>
+      <w:bookmarkStart w:id="0" w:name="_GoBack"/>
+      <w:bookmarkEnd w:id="0"/>
+    </w:p>
     <w:sectPr>
       <w:pgSz w:w="11906" w:h="16838"/>
       <w:pgMar w:top="1417" w:right="1701" w:bottom="1417" w:left="1701" w:header="708" w:footer="708" w:gutter="0"/>
@@ -1606,6 +1821,12 @@
 </file>
 
 <file path=customXml/item2.xml><?xml version="1.0" encoding="utf-8"?>
+<p:properties xmlns:p="http://schemas.microsoft.com/office/2006/metadata/properties" xmlns:xsi="http://www.w3.org/2001/XMLSchema-instance" xmlns:pc="http://schemas.microsoft.com/office/infopath/2007/PartnerControls">
+  <documentManagement/>
+</p:properties>
+</file>
+
+<file path=customXml/item3.xml><?xml version="1.0" encoding="utf-8"?>
 <?mso-contentType ?>
 <FormTemplates xmlns="http://schemas.microsoft.com/sharepoint/v3/contenttype/forms">
   <Display>DocumentLibraryForm</Display>
@@ -1614,20 +1835,37 @@
 </FormTemplates>
 </file>
 
-<file path=customXml/item3.xml><?xml version="1.0" encoding="utf-8"?>
-<p:properties xmlns:p="http://schemas.microsoft.com/office/2006/metadata/properties" xmlns:xsi="http://www.w3.org/2001/XMLSchema-instance" xmlns:pc="http://schemas.microsoft.com/office/infopath/2007/PartnerControls">
-  <documentManagement/>
-</p:properties>
-</file>
-
 <file path=customXml/itemProps1.xml><?xml version="1.0" encoding="utf-8"?>
-<ds:datastoreItem xmlns:ds="http://schemas.openxmlformats.org/officeDocument/2006/customXml" ds:itemID="{1D4A746C-5C76-4866-A195-D3EAC620E47A}"/>
+<ds:datastoreItem xmlns:ds="http://schemas.openxmlformats.org/officeDocument/2006/customXml" ds:itemID="{1D4A746C-5C76-4866-A195-D3EAC620E47A}">
+  <ds:schemaRefs>
+    <ds:schemaRef ds:uri="http://schemas.microsoft.com/office/2006/metadata/contentType"/>
+    <ds:schemaRef ds:uri="http://schemas.microsoft.com/office/2006/metadata/properties/metaAttributes"/>
+    <ds:schemaRef ds:uri="http://www.w3.org/2001/XMLSchema"/>
+    <ds:schemaRef ds:uri="http://schemas.microsoft.com/office/2006/metadata/properties"/>
+    <ds:schemaRef ds:uri="a97ea620-bd91-4936-8934-7957480f18b3"/>
+    <ds:schemaRef ds:uri="http://schemas.microsoft.com/office/2006/documentManagement/types"/>
+    <ds:schemaRef ds:uri="http://schemas.microsoft.com/office/infopath/2007/PartnerControls"/>
+    <ds:schemaRef ds:uri="http://schemas.openxmlformats.org/package/2006/metadata/core-properties"/>
+    <ds:schemaRef ds:uri="http://purl.org/dc/elements/1.1/"/>
+    <ds:schemaRef ds:uri="http://purl.org/dc/terms/"/>
+    <ds:schemaRef ds:uri="http://schemas.microsoft.com/internal/obd"/>
+  </ds:schemaRefs>
+</ds:datastoreItem>
 </file>
 
 <file path=customXml/itemProps2.xml><?xml version="1.0" encoding="utf-8"?>
-<ds:datastoreItem xmlns:ds="http://schemas.openxmlformats.org/officeDocument/2006/customXml" ds:itemID="{9EFEB32B-329B-4D6A-85E0-F850883ED968}"/>
+<ds:datastoreItem xmlns:ds="http://schemas.openxmlformats.org/officeDocument/2006/customXml" ds:itemID="{4B392212-AAC0-4628-B7C2-D11C50087BFF}">
+  <ds:schemaRefs>
+    <ds:schemaRef ds:uri="http://schemas.microsoft.com/office/2006/metadata/properties"/>
+    <ds:schemaRef ds:uri="http://schemas.microsoft.com/office/infopath/2007/PartnerControls"/>
+  </ds:schemaRefs>
+</ds:datastoreItem>
 </file>
 
 <file path=customXml/itemProps3.xml><?xml version="1.0" encoding="utf-8"?>
-<ds:datastoreItem xmlns:ds="http://schemas.openxmlformats.org/officeDocument/2006/customXml" ds:itemID="{4B392212-AAC0-4628-B7C2-D11C50087BFF}"/>
+<ds:datastoreItem xmlns:ds="http://schemas.openxmlformats.org/officeDocument/2006/customXml" ds:itemID="{9EFEB32B-329B-4D6A-85E0-F850883ED968}">
+  <ds:schemaRefs>
+    <ds:schemaRef ds:uri="http://schemas.microsoft.com/sharepoint/v3/contenttype/forms"/>
+  </ds:schemaRefs>
+</ds:datastoreItem>
 </file>
</xml_diff>